<commit_message>
Updating documentation for current system design
</commit_message>
<xml_diff>
--- a/projects/SystemDesign.docx
+++ b/projects/SystemDesign.docx
@@ -104,84 +104,7 @@
         </mc:AlternateContent>
       </w:r>
     </w:p>
-    <w:p>
-      <w:r>
-        <w:rPr>
-          <w:noProof/>
-        </w:rPr>
-        <mc:AlternateContent>
-          <mc:Choice Requires="wps">
-            <w:drawing>
-              <wp:anchor distT="0" distB="0" distL="114300" distR="114300" simplePos="0" relativeHeight="251698176" behindDoc="0" locked="0" layoutInCell="1" allowOverlap="1" wp14:anchorId="0999CC99" wp14:editId="6C4AB676">
-                <wp:simplePos x="0" y="0"/>
-                <wp:positionH relativeFrom="column">
-                  <wp:posOffset>0</wp:posOffset>
-                </wp:positionH>
-                <wp:positionV relativeFrom="paragraph">
-                  <wp:posOffset>38100</wp:posOffset>
-                </wp:positionV>
-                <wp:extent cx="1219200" cy="1543050"/>
-                <wp:effectExtent l="0" t="38100" r="57150" b="19050"/>
-                <wp:wrapNone/>
-                <wp:docPr id="1352314662" name="Straight Arrow Connector 3"/>
-                <wp:cNvGraphicFramePr/>
-                <a:graphic xmlns:a="http://schemas.openxmlformats.org/drawingml/2006/main">
-                  <a:graphicData uri="http://schemas.microsoft.com/office/word/2010/wordprocessingShape">
-                    <wps:wsp>
-                      <wps:cNvCnPr/>
-                      <wps:spPr>
-                        <a:xfrm flipV="1">
-                          <a:off x="0" y="0"/>
-                          <a:ext cx="1219200" cy="1543050"/>
-                        </a:xfrm>
-                        <a:prstGeom prst="straightConnector1">
-                          <a:avLst/>
-                        </a:prstGeom>
-                        <a:ln>
-                          <a:tailEnd type="triangle"/>
-                        </a:ln>
-                      </wps:spPr>
-                      <wps:style>
-                        <a:lnRef idx="2">
-                          <a:schemeClr val="accent1"/>
-                        </a:lnRef>
-                        <a:fillRef idx="0">
-                          <a:schemeClr val="accent1"/>
-                        </a:fillRef>
-                        <a:effectRef idx="1">
-                          <a:schemeClr val="accent1"/>
-                        </a:effectRef>
-                        <a:fontRef idx="minor">
-                          <a:schemeClr val="tx1"/>
-                        </a:fontRef>
-                      </wps:style>
-                      <wps:bodyPr/>
-                    </wps:wsp>
-                  </a:graphicData>
-                </a:graphic>
-                <wp14:sizeRelH relativeFrom="margin">
-                  <wp14:pctWidth>0</wp14:pctWidth>
-                </wp14:sizeRelH>
-                <wp14:sizeRelV relativeFrom="margin">
-                  <wp14:pctHeight>0</wp14:pctHeight>
-                </wp14:sizeRelV>
-              </wp:anchor>
-            </w:drawing>
-          </mc:Choice>
-          <mc:Fallback>
-            <w:pict>
-              <v:shapetype w14:anchorId="4D555D81" id="_x0000_t32" coordsize="21600,21600" o:spt="32" o:oned="t" path="m,l21600,21600e" filled="f">
-                <v:path arrowok="t" fillok="f" o:connecttype="none"/>
-                <o:lock v:ext="edit" shapetype="t"/>
-              </v:shapetype>
-              <v:shape id="Straight Arrow Connector 3" o:spid="_x0000_s1026" type="#_x0000_t32" style="position:absolute;margin-left:0;margin-top:3pt;width:96pt;height:121.5pt;flip:y;z-index:251698176;visibility:visible;mso-wrap-style:square;mso-width-percent:0;mso-height-percent:0;mso-wrap-distance-left:9pt;mso-wrap-distance-top:0;mso-wrap-distance-right:9pt;mso-wrap-distance-bottom:0;mso-position-horizontal:absolute;mso-position-horizontal-relative:text;mso-position-vertical:absolute;mso-position-vertical-relative:text;mso-width-percent:0;mso-height-percent:0;mso-width-relative:margin;mso-height-relative:margin" o:gfxdata="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" strokecolor="#156082 [3204]" strokeweight="1.5pt">
-                <v:stroke endarrow="block" joinstyle="miter"/>
-              </v:shape>
-            </w:pict>
-          </mc:Fallback>
-        </mc:AlternateContent>
-      </w:r>
-    </w:p>
+    <w:p/>
     <w:p>
       <w:r>
         <w:rPr>
@@ -248,7 +171,11 @@
           </mc:Choice>
           <mc:Fallback>
             <w:pict>
-              <v:shape w14:anchorId="0DFFA3FB" id="Straight Arrow Connector 3" o:spid="_x0000_s1026" type="#_x0000_t32" style="position:absolute;margin-left:171pt;margin-top:4.05pt;width:189pt;height:114pt;flip:y;z-index:251661312;visibility:visible;mso-wrap-style:square;mso-width-percent:0;mso-height-percent:0;mso-wrap-distance-left:9pt;mso-wrap-distance-top:0;mso-wrap-distance-right:9pt;mso-wrap-distance-bottom:0;mso-position-horizontal:absolute;mso-position-horizontal-relative:text;mso-position-vertical:absolute;mso-position-vertical-relative:text;mso-width-percent:0;mso-height-percent:0;mso-width-relative:margin;mso-height-relative:margin" o:gfxdata="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" strokecolor="#156082 [3204]" strokeweight="1.5pt">
+              <v:shapetype w14:anchorId="64BDBCEE" id="_x0000_t32" coordsize="21600,21600" o:spt="32" o:oned="t" path="m,l21600,21600e" filled="f">
+                <v:path arrowok="t" fillok="f" o:connecttype="none"/>
+                <o:lock v:ext="edit" shapetype="t"/>
+              </v:shapetype>
+              <v:shape id="Straight Arrow Connector 3" o:spid="_x0000_s1026" type="#_x0000_t32" style="position:absolute;margin-left:171pt;margin-top:4.05pt;width:189pt;height:114pt;flip:y;z-index:251661312;visibility:visible;mso-wrap-style:square;mso-width-percent:0;mso-height-percent:0;mso-wrap-distance-left:9pt;mso-wrap-distance-top:0;mso-wrap-distance-right:9pt;mso-wrap-distance-bottom:0;mso-position-horizontal:absolute;mso-position-horizontal-relative:text;mso-position-vertical:absolute;mso-position-vertical-relative:text;mso-width-percent:0;mso-height-percent:0;mso-width-relative:margin;mso-height-relative:margin" o:gfxdata="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" strokecolor="#156082 [3204]" strokeweight="1.5pt">
                 <v:stroke endarrow="block" joinstyle="miter"/>
               </v:shape>
             </w:pict>
@@ -264,79 +191,7 @@
         <mc:AlternateContent>
           <mc:Choice Requires="wps">
             <w:drawing>
-              <wp:anchor distT="0" distB="0" distL="114300" distR="114300" simplePos="0" relativeHeight="251696128" behindDoc="0" locked="0" layoutInCell="1" allowOverlap="1" wp14:anchorId="01ACA2D0" wp14:editId="56EEB42B">
-                <wp:simplePos x="0" y="0"/>
-                <wp:positionH relativeFrom="column">
-                  <wp:posOffset>0</wp:posOffset>
-                </wp:positionH>
-                <wp:positionV relativeFrom="paragraph">
-                  <wp:posOffset>38100</wp:posOffset>
-                </wp:positionV>
-                <wp:extent cx="1219200" cy="1543050"/>
-                <wp:effectExtent l="0" t="38100" r="57150" b="19050"/>
-                <wp:wrapNone/>
-                <wp:docPr id="590824076" name="Straight Arrow Connector 3"/>
-                <wp:cNvGraphicFramePr/>
-                <a:graphic xmlns:a="http://schemas.openxmlformats.org/drawingml/2006/main">
-                  <a:graphicData uri="http://schemas.microsoft.com/office/word/2010/wordprocessingShape">
-                    <wps:wsp>
-                      <wps:cNvCnPr/>
-                      <wps:spPr>
-                        <a:xfrm flipV="1">
-                          <a:off x="0" y="0"/>
-                          <a:ext cx="1219200" cy="1543050"/>
-                        </a:xfrm>
-                        <a:prstGeom prst="straightConnector1">
-                          <a:avLst/>
-                        </a:prstGeom>
-                        <a:ln>
-                          <a:tailEnd type="triangle"/>
-                        </a:ln>
-                      </wps:spPr>
-                      <wps:style>
-                        <a:lnRef idx="2">
-                          <a:schemeClr val="accent1"/>
-                        </a:lnRef>
-                        <a:fillRef idx="0">
-                          <a:schemeClr val="accent1"/>
-                        </a:fillRef>
-                        <a:effectRef idx="1">
-                          <a:schemeClr val="accent1"/>
-                        </a:effectRef>
-                        <a:fontRef idx="minor">
-                          <a:schemeClr val="tx1"/>
-                        </a:fontRef>
-                      </wps:style>
-                      <wps:bodyPr/>
-                    </wps:wsp>
-                  </a:graphicData>
-                </a:graphic>
-                <wp14:sizeRelH relativeFrom="margin">
-                  <wp14:pctWidth>0</wp14:pctWidth>
-                </wp14:sizeRelH>
-                <wp14:sizeRelV relativeFrom="margin">
-                  <wp14:pctHeight>0</wp14:pctHeight>
-                </wp14:sizeRelV>
-              </wp:anchor>
-            </w:drawing>
-          </mc:Choice>
-          <mc:Fallback>
-            <w:pict>
-              <v:shape w14:anchorId="46F1B06B" id="Straight Arrow Connector 3" o:spid="_x0000_s1026" type="#_x0000_t32" style="position:absolute;margin-left:0;margin-top:3pt;width:96pt;height:121.5pt;flip:y;z-index:251696128;visibility:visible;mso-wrap-style:square;mso-width-percent:0;mso-height-percent:0;mso-wrap-distance-left:9pt;mso-wrap-distance-top:0;mso-wrap-distance-right:9pt;mso-wrap-distance-bottom:0;mso-position-horizontal:absolute;mso-position-horizontal-relative:text;mso-position-vertical:absolute;mso-position-vertical-relative:text;mso-width-percent:0;mso-height-percent:0;mso-width-relative:margin;mso-height-relative:margin" o:gfxdata="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" strokecolor="#156082 [3204]" strokeweight="1.5pt">
-                <v:stroke endarrow="block" joinstyle="miter"/>
-              </v:shape>
-            </w:pict>
-          </mc:Fallback>
-        </mc:AlternateContent>
-      </w:r>
-      <w:r>
-        <w:rPr>
-          <w:noProof/>
-        </w:rPr>
-        <mc:AlternateContent>
-          <mc:Choice Requires="wps">
-            <w:drawing>
-              <wp:anchor distT="0" distB="0" distL="114300" distR="114300" simplePos="0" relativeHeight="251692032" behindDoc="0" locked="0" layoutInCell="1" allowOverlap="1" wp14:anchorId="33A38615" wp14:editId="36F3D4EF">
+              <wp:anchor distT="0" distB="0" distL="114300" distR="114300" simplePos="0" relativeHeight="251692032" behindDoc="0" locked="0" layoutInCell="1" allowOverlap="1" wp14:anchorId="33A38615" wp14:editId="3AA28A06">
                 <wp:simplePos x="0" y="0"/>
                 <wp:positionH relativeFrom="column">
                   <wp:posOffset>2200275</wp:posOffset>
@@ -394,7 +249,7 @@
           </mc:Choice>
           <mc:Fallback>
             <w:pict>
-              <v:shape w14:anchorId="2087B18A" id="Straight Arrow Connector 3" o:spid="_x0000_s1026" type="#_x0000_t32" style="position:absolute;margin-left:173.25pt;margin-top:131.35pt;width:182.25pt;height:171.75pt;z-index:251692032;visibility:visible;mso-wrap-style:square;mso-width-percent:0;mso-height-percent:0;mso-wrap-distance-left:9pt;mso-wrap-distance-top:0;mso-wrap-distance-right:9pt;mso-wrap-distance-bottom:0;mso-position-horizontal:absolute;mso-position-horizontal-relative:text;mso-position-vertical:absolute;mso-position-vertical-relative:text;mso-width-percent:0;mso-height-percent:0;mso-width-relative:margin;mso-height-relative:margin" o:gfxdata="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" strokecolor="#156082 [3204]" strokeweight="1.5pt">
+              <v:shape w14:anchorId="71987E65" id="Straight Arrow Connector 3" o:spid="_x0000_s1026" type="#_x0000_t32" style="position:absolute;margin-left:173.25pt;margin-top:131.35pt;width:182.25pt;height:171.75pt;z-index:251692032;visibility:visible;mso-wrap-style:square;mso-width-percent:0;mso-height-percent:0;mso-wrap-distance-left:9pt;mso-wrap-distance-top:0;mso-wrap-distance-right:9pt;mso-wrap-distance-bottom:0;mso-position-horizontal:absolute;mso-position-horizontal-relative:text;mso-position-vertical:absolute;mso-position-vertical-relative:text;mso-width-percent:0;mso-height-percent:0;mso-width-relative:margin;mso-height-relative:margin" o:gfxdata="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" strokecolor="#156082 [3204]" strokeweight="1.5pt">
                 <v:stroke endarrow="block" joinstyle="miter"/>
               </v:shape>
             </w:pict>
@@ -466,7 +321,7 @@
           </mc:Choice>
           <mc:Fallback>
             <w:pict>
-              <v:shape w14:anchorId="0EF80EAA" id="Straight Arrow Connector 3" o:spid="_x0000_s1026" type="#_x0000_t32" style="position:absolute;margin-left:171pt;margin-top:151.6pt;width:157.5pt;height:254.25pt;z-index:251694080;visibility:visible;mso-wrap-style:square;mso-width-percent:0;mso-height-percent:0;mso-wrap-distance-left:9pt;mso-wrap-distance-top:0;mso-wrap-distance-right:9pt;mso-wrap-distance-bottom:0;mso-position-horizontal:absolute;mso-position-horizontal-relative:text;mso-position-vertical:absolute;mso-position-vertical-relative:text;mso-width-percent:0;mso-height-percent:0;mso-width-relative:margin;mso-height-relative:margin" o:gfxdata="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" strokecolor="#156082 [3204]" strokeweight="1.5pt">
+              <v:shape w14:anchorId="57AD945E" id="Straight Arrow Connector 3" o:spid="_x0000_s1026" type="#_x0000_t32" style="position:absolute;margin-left:171pt;margin-top:151.6pt;width:157.5pt;height:254.25pt;z-index:251694080;visibility:visible;mso-wrap-style:square;mso-width-percent:0;mso-height-percent:0;mso-wrap-distance-left:9pt;mso-wrap-distance-top:0;mso-wrap-distance-right:9pt;mso-wrap-distance-bottom:0;mso-position-horizontal:absolute;mso-position-horizontal-relative:text;mso-position-vertical:absolute;mso-position-vertical-relative:text;mso-width-percent:0;mso-height-percent:0;mso-width-relative:margin;mso-height-relative:margin" o:gfxdata="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" strokecolor="#156082 [3204]" strokeweight="1.5pt">
                 <v:stroke endarrow="block" joinstyle="miter"/>
               </v:shape>
             </w:pict>
@@ -538,7 +393,7 @@
           </mc:Choice>
           <mc:Fallback>
             <w:pict>
-              <v:shape w14:anchorId="12163ACA" id="Straight Arrow Connector 10" o:spid="_x0000_s1026" type="#_x0000_t32" style="position:absolute;margin-left:171pt;margin-top:113.35pt;width:189pt;height:112.5pt;z-index:251668480;visibility:visible;mso-wrap-style:square;mso-width-percent:0;mso-height-percent:0;mso-wrap-distance-left:9pt;mso-wrap-distance-top:0;mso-wrap-distance-right:9pt;mso-wrap-distance-bottom:0;mso-position-horizontal:absolute;mso-position-horizontal-relative:text;mso-position-vertical:absolute;mso-position-vertical-relative:text;mso-width-percent:0;mso-height-percent:0;mso-width-relative:margin;mso-height-relative:margin" o:gfxdata="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" strokecolor="#156082 [3204]" strokeweight="1.5pt">
+              <v:shape w14:anchorId="47D13FC0" id="Straight Arrow Connector 10" o:spid="_x0000_s1026" type="#_x0000_t32" style="position:absolute;margin-left:171pt;margin-top:113.35pt;width:189pt;height:112.5pt;z-index:251668480;visibility:visible;mso-wrap-style:square;mso-width-percent:0;mso-height-percent:0;mso-wrap-distance-left:9pt;mso-wrap-distance-top:0;mso-wrap-distance-right:9pt;mso-wrap-distance-bottom:0;mso-position-horizontal:absolute;mso-position-horizontal-relative:text;mso-position-vertical:absolute;mso-position-vertical-relative:text;mso-width-percent:0;mso-height-percent:0;mso-width-relative:margin;mso-height-relative:margin" o:gfxdata="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" strokecolor="#156082 [3204]" strokeweight="1.5pt">
                 <v:stroke endarrow="block" joinstyle="miter"/>
               </v:shape>
             </w:pict>
@@ -610,7 +465,7 @@
           </mc:Choice>
           <mc:Fallback>
             <w:pict>
-              <v:shape w14:anchorId="61B780A0" id="Straight Arrow Connector 11" o:spid="_x0000_s1026" type="#_x0000_t32" style="position:absolute;margin-left:171pt;margin-top:106.6pt;width:189pt;height:20.25pt;z-index:251669504;visibility:visible;mso-wrap-style:square;mso-width-percent:0;mso-height-percent:0;mso-wrap-distance-left:9pt;mso-wrap-distance-top:0;mso-wrap-distance-right:9pt;mso-wrap-distance-bottom:0;mso-position-horizontal:absolute;mso-position-horizontal-relative:text;mso-position-vertical:absolute;mso-position-vertical-relative:text;mso-width-percent:0;mso-height-percent:0;mso-width-relative:margin;mso-height-relative:margin" o:gfxdata="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" strokecolor="#156082 [3204]" strokeweight="1.5pt">
+              <v:shape w14:anchorId="346F7693" id="Straight Arrow Connector 11" o:spid="_x0000_s1026" type="#_x0000_t32" style="position:absolute;margin-left:171pt;margin-top:106.6pt;width:189pt;height:20.25pt;z-index:251669504;visibility:visible;mso-wrap-style:square;mso-width-percent:0;mso-height-percent:0;mso-wrap-distance-left:9pt;mso-wrap-distance-top:0;mso-wrap-distance-right:9pt;mso-wrap-distance-bottom:0;mso-position-horizontal:absolute;mso-position-horizontal-relative:text;mso-position-vertical:absolute;mso-position-vertical-relative:text;mso-width-percent:0;mso-height-percent:0;mso-width-relative:margin;mso-height-relative:margin" o:gfxdata="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" strokecolor="#156082 [3204]" strokeweight="1.5pt">
                 <v:stroke endarrow="block" joinstyle="miter"/>
               </v:shape>
             </w:pict>
@@ -682,7 +537,7 @@
           </mc:Choice>
           <mc:Fallback>
             <w:pict>
-              <v:shape w14:anchorId="502A0B86" id="Straight Arrow Connector 9" o:spid="_x0000_s1026" type="#_x0000_t32" style="position:absolute;margin-left:168.75pt;margin-top:39.1pt;width:193.5pt;height:65.25pt;flip:y;z-index:251667456;visibility:visible;mso-wrap-style:square;mso-width-percent:0;mso-height-percent:0;mso-wrap-distance-left:9pt;mso-wrap-distance-top:0;mso-wrap-distance-right:9pt;mso-wrap-distance-bottom:0;mso-position-horizontal:absolute;mso-position-horizontal-relative:text;mso-position-vertical:absolute;mso-position-vertical-relative:text;mso-width-percent:0;mso-height-percent:0;mso-width-relative:margin;mso-height-relative:margin" o:gfxdata="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" strokecolor="#156082 [3204]" strokeweight="1.5pt">
+              <v:shape w14:anchorId="4317550A" id="Straight Arrow Connector 9" o:spid="_x0000_s1026" type="#_x0000_t32" style="position:absolute;margin-left:168.75pt;margin-top:39.1pt;width:193.5pt;height:65.25pt;flip:y;z-index:251667456;visibility:visible;mso-wrap-style:square;mso-width-percent:0;mso-height-percent:0;mso-wrap-distance-left:9pt;mso-wrap-distance-top:0;mso-wrap-distance-right:9pt;mso-wrap-distance-bottom:0;mso-position-horizontal:absolute;mso-position-horizontal-relative:text;mso-position-vertical:absolute;mso-position-vertical-relative:text;mso-width-percent:0;mso-height-percent:0;mso-width-relative:margin;mso-height-relative:margin" o:gfxdata="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" strokecolor="#156082 [3204]" strokeweight="1.5pt">
                 <v:stroke endarrow="block" joinstyle="miter"/>
               </v:shape>
             </w:pict>
@@ -850,7 +705,7 @@
           </mc:Choice>
           <mc:Fallback>
             <w:pict>
-              <v:shape w14:anchorId="1DF4FFC5" id="Straight Arrow Connector 2" o:spid="_x0000_s1026" type="#_x0000_t32" style="position:absolute;margin-left:25.5pt;margin-top:108.05pt;width:51pt;height:3.6pt;flip:y;z-index:251660288;visibility:visible;mso-wrap-style:square;mso-width-percent:0;mso-height-percent:0;mso-wrap-distance-left:9pt;mso-wrap-distance-top:0;mso-wrap-distance-right:9pt;mso-wrap-distance-bottom:0;mso-position-horizontal:absolute;mso-position-horizontal-relative:text;mso-position-vertical:absolute;mso-position-vertical-relative:text;mso-width-percent:0;mso-height-percent:0;mso-width-relative:margin;mso-height-relative:margin" o:gfxdata="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" strokecolor="#156082 [3204]" strokeweight="1.5pt">
+              <v:shape w14:anchorId="7BA8EE53" id="Straight Arrow Connector 2" o:spid="_x0000_s1026" type="#_x0000_t32" style="position:absolute;margin-left:25.5pt;margin-top:108.05pt;width:51pt;height:3.6pt;flip:y;z-index:251660288;visibility:visible;mso-wrap-style:square;mso-width-percent:0;mso-height-percent:0;mso-wrap-distance-left:9pt;mso-wrap-distance-top:0;mso-wrap-distance-right:9pt;mso-wrap-distance-bottom:0;mso-position-horizontal:absolute;mso-position-horizontal-relative:text;mso-position-vertical:absolute;mso-position-vertical-relative:text;mso-width-percent:0;mso-height-percent:0;mso-width-relative:margin;mso-height-relative:margin" o:gfxdata="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" strokecolor="#156082 [3204]" strokeweight="1.5pt">
                 <v:stroke endarrow="block" joinstyle="miter"/>
               </v:shape>
             </w:pict>

</xml_diff>